<commit_message>
Update to the welcome document
</commit_message>
<xml_diff>
--- a/admin/Lisez-moi.docx
+++ b/admin/Lisez-moi.docx
@@ -5,16 +5,37 @@
     <w:p>
       <w:pPr>
         <w:pStyle w:val="Heading1"/>
-        <w:spacing w:before="0"/>
-      </w:pPr>
+        <w:tabs>
+          <w:tab w:val="right" w:pos="10800"/>
+        </w:tabs>
+        <w:spacing w:before="0" w:after="0"/>
+      </w:pPr>
+      <w:r>
+        <w:rPr>
+          <w:b/>
+          <w:bCs/>
+          <w:sz w:val="72"/>
+          <w:szCs w:val="72"/>
+        </w:rPr>
+        <w:t>Structure de l’export</w:t>
+      </w:r>
+      <w:r>
+        <w:rPr>
+          <w:b/>
+          <w:bCs/>
+          <w:sz w:val="72"/>
+          <w:szCs w:val="72"/>
+        </w:rPr>
+        <w:tab/>
+      </w:r>
       <w:r>
         <w:rPr>
           <w:noProof/>
         </w:rPr>
         <w:drawing>
-          <wp:inline distT="0" distB="0" distL="0" distR="0" wp14:anchorId="13AF6498" wp14:editId="15C00815">
-            <wp:extent cx="2489200" cy="920869"/>
-            <wp:effectExtent l="0" t="0" r="0" b="0"/>
+          <wp:inline distT="0" distB="0" distL="0" distR="0" wp14:anchorId="72765774" wp14:editId="47909343">
+            <wp:extent cx="2031679" cy="751611"/>
+            <wp:effectExtent l="0" t="0" r="635" b="0"/>
             <wp:docPr id="507576727" name="Graphic 1"/>
             <wp:cNvGraphicFramePr>
               <a:graphicFrameLocks xmlns:a="http://schemas.openxmlformats.org/drawingml/2006/main" noChangeAspect="1"/>
@@ -42,7 +63,7 @@
                   <pic:spPr bwMode="auto">
                     <a:xfrm>
                       <a:off x="0" y="0"/>
-                      <a:ext cx="2577497" cy="953534"/>
+                      <a:ext cx="2124397" cy="785912"/>
                     </a:xfrm>
                     <a:prstGeom prst="rect">
                       <a:avLst/>
@@ -61,35 +82,6 @@
             </a:graphic>
           </wp:inline>
         </w:drawing>
-      </w:r>
-    </w:p>
-    <w:p>
-      <w:pPr>
-        <w:pStyle w:val="Heading1"/>
-        <w:rPr>
-          <w:b/>
-          <w:bCs/>
-          <w:sz w:val="52"/>
-          <w:szCs w:val="52"/>
-        </w:rPr>
-      </w:pPr>
-      <w:r>
-        <w:rPr>
-          <w:b/>
-          <w:bCs/>
-          <w:sz w:val="52"/>
-          <w:szCs w:val="52"/>
-        </w:rPr>
-        <w:t>Structure de l’export</w:t>
-      </w:r>
-      <w:r>
-        <w:rPr>
-          <w:b/>
-          <w:bCs/>
-          <w:sz w:val="52"/>
-          <w:szCs w:val="52"/>
-        </w:rPr>
-        <w:t> :</w:t>
       </w:r>
     </w:p>
     <w:p/>
@@ -131,6 +123,7 @@
                 <w:rFonts w:ascii="Courier New" w:hAnsi="Courier New" w:cs="Courier New"/>
                 <w:b/>
                 <w:bCs/>
+                <w:noProof/>
                 <w:position w:val="-10"/>
               </w:rPr>
               <w:drawing>
@@ -219,7 +212,16 @@
               <w:t xml:space="preserve">des données extraites </w:t>
             </w:r>
             <w:r>
-              <w:t xml:space="preserve">sont remplacées par des affiches démo. Toutes les véritables pièces jointes sont incluses dans ce répertoire lors d’un export complet. </w:t>
+              <w:t xml:space="preserve">sont remplacées par des affiches démo. </w:t>
+            </w:r>
+            <w:r>
+              <w:rPr>
+                <w:u w:val="single"/>
+              </w:rPr>
+              <w:t>Toutes</w:t>
+            </w:r>
+            <w:r>
+              <w:t xml:space="preserve"> les véritables pièces jointes sont incluses dans ce répertoire lors d’un export complet. </w:t>
             </w:r>
           </w:p>
         </w:tc>
@@ -241,6 +243,7 @@
                 <w:rFonts w:ascii="Courier New" w:hAnsi="Courier New" w:cs="Courier New"/>
                 <w:b/>
                 <w:bCs/>
+                <w:noProof/>
                 <w:position w:val="-10"/>
               </w:rPr>
               <w:drawing>
@@ -339,6 +342,7 @@
                 <w:rFonts w:ascii="Courier New" w:hAnsi="Courier New" w:cs="Courier New"/>
                 <w:b/>
                 <w:bCs/>
+                <w:noProof/>
                 <w:position w:val="-10"/>
               </w:rPr>
               <w:drawing>
@@ -414,6 +418,71 @@
               </w:rPr>
               <w:t>Ouvrir ce fichier avec un navigateur pour consulter l’application web permettant de consulter les données.</w:t>
             </w:r>
+            <w:r>
+              <w:rPr>
+                <w:b/>
+                <w:bCs/>
+              </w:rPr>
+              <w:br/>
+            </w:r>
+          </w:p>
+          <w:p>
+            <w:pPr>
+              <w:rPr>
+                <w:i/>
+                <w:iCs/>
+              </w:rPr>
+            </w:pPr>
+            <w:r>
+              <w:rPr>
+                <w:i/>
+                <w:iCs/>
+              </w:rPr>
+              <w:t>Note : l</w:t>
+            </w:r>
+            <w:r>
+              <w:rPr>
+                <w:i/>
+                <w:iCs/>
+              </w:rPr>
+              <w:t xml:space="preserve">’app de consultation n’est </w:t>
+            </w:r>
+            <w:r>
+              <w:rPr>
+                <w:i/>
+                <w:iCs/>
+                <w:u w:val="single"/>
+              </w:rPr>
+              <w:t>pas</w:t>
+            </w:r>
+            <w:r>
+              <w:rPr>
+                <w:i/>
+                <w:iCs/>
+              </w:rPr>
+              <w:t xml:space="preserve"> conçue pour reproduire fidèlement l’apparence visuelle de PL, et donc les champs peuvent être organisés de manière différente</w:t>
+            </w:r>
+            <w:r>
+              <w:rPr>
+                <w:i/>
+                <w:iCs/>
+              </w:rPr>
+              <w:t>. Le point important est que les fichiers XML</w:t>
+            </w:r>
+            <w:r>
+              <w:rPr>
+                <w:i/>
+                <w:iCs/>
+              </w:rPr>
+              <w:t>, eux,</w:t>
+            </w:r>
+            <w:r>
+              <w:rPr>
+                <w:i/>
+                <w:iCs/>
+              </w:rPr>
+              <w:t xml:space="preserve"> sont structurés de manière stricte.</w:t>
+            </w:r>
           </w:p>
         </w:tc>
       </w:tr>
@@ -440,6 +509,7 @@
             <w:r>
               <w:rPr>
                 <w:rFonts w:ascii="Courier New" w:hAnsi="Courier New" w:cs="Courier New"/>
+                <w:noProof/>
                 <w:position w:val="-10"/>
               </w:rPr>
               <w:drawing>
@@ -546,6 +616,7 @@
             <w:r>
               <w:rPr>
                 <w:rFonts w:ascii="Courier New" w:hAnsi="Courier New" w:cs="Courier New"/>
+                <w:noProof/>
                 <w:position w:val="-10"/>
               </w:rPr>
               <w:drawing>
@@ -630,6 +701,7 @@
             <w:r>
               <w:rPr>
                 <w:rFonts w:ascii="Courier New" w:hAnsi="Courier New" w:cs="Courier New"/>
+                <w:noProof/>
                 <w:position w:val="-10"/>
               </w:rPr>
               <w:drawing>
@@ -714,6 +786,7 @@
             <w:r>
               <w:rPr>
                 <w:rFonts w:ascii="Courier New" w:hAnsi="Courier New" w:cs="Courier New"/>
+                <w:noProof/>
                 <w:position w:val="-10"/>
               </w:rPr>
               <w:drawing>
@@ -798,6 +871,7 @@
             <w:r>
               <w:rPr>
                 <w:rFonts w:ascii="Courier New" w:hAnsi="Courier New" w:cs="Courier New"/>
+                <w:noProof/>
                 <w:position w:val="-10"/>
               </w:rPr>
               <w:drawing>
@@ -876,6 +950,7 @@
                 <w:rFonts w:ascii="Courier New" w:hAnsi="Courier New" w:cs="Courier New"/>
                 <w:b/>
                 <w:bCs/>
+                <w:noProof/>
                 <w:position w:val="-10"/>
               </w:rPr>
               <w:drawing>
@@ -967,6 +1042,7 @@
             <w:r>
               <w:rPr>
                 <w:rFonts w:ascii="Courier New" w:hAnsi="Courier New" w:cs="Courier New"/>
+                <w:noProof/>
                 <w:position w:val="-10"/>
               </w:rPr>
               <w:drawing>
@@ -1052,6 +1128,7 @@
                 <w:rFonts w:ascii="Courier New" w:hAnsi="Courier New" w:cs="Courier New"/>
                 <w:b/>
                 <w:bCs/>
+                <w:noProof/>
                 <w:position w:val="-10"/>
               </w:rPr>
               <w:drawing>
@@ -1096,15 +1173,7 @@
                 <w:b/>
                 <w:bCs/>
               </w:rPr>
-              <w:t xml:space="preserve"> </w:t>
-            </w:r>
-            <w:r>
-              <w:rPr>
-                <w:rFonts w:ascii="Courier New" w:hAnsi="Courier New" w:cs="Courier New"/>
-                <w:b/>
-                <w:bCs/>
-              </w:rPr>
-              <w:t>Schema.xsd</w:t>
+              <w:t xml:space="preserve"> Schema.xsd</w:t>
             </w:r>
           </w:p>
         </w:tc>
@@ -1150,6 +1219,7 @@
             <w:r>
               <w:rPr>
                 <w:rFonts w:ascii="Courier New" w:hAnsi="Courier New" w:cs="Courier New"/>
+                <w:noProof/>
                 <w:position w:val="-10"/>
               </w:rPr>
               <w:drawing>
@@ -1242,6 +1312,7 @@
             <w:r>
               <w:rPr>
                 <w:rFonts w:ascii="Courier New" w:hAnsi="Courier New" w:cs="Courier New"/>
+                <w:noProof/>
                 <w:position w:val="-10"/>
               </w:rPr>
               <w:drawing>
@@ -1305,16 +1376,20 @@
               <w:t xml:space="preserve">Ces répertoires contiennent les </w:t>
             </w:r>
             <w:r>
-              <w:t xml:space="preserve">fichiers XML individuels </w:t>
-            </w:r>
-            <w:r>
-              <w:t>par type de donnée</w:t>
-            </w:r>
-            <w:r>
-              <w:t>, organisés par module.</w:t>
-            </w:r>
-            <w:r>
-              <w:t xml:space="preserve"> Toutes les données y sont, de façon structurée.</w:t>
+              <w:rPr>
+                <w:b/>
+                <w:bCs/>
+              </w:rPr>
+              <w:t>fichiers XML</w:t>
+            </w:r>
+            <w:r>
+              <w:t xml:space="preserve"> individuels par type de donnée, organisés par module.</w:t>
+            </w:r>
+            <w:r>
+              <w:t xml:space="preserve"> Toutes les données y sont, de façon structurée</w:t>
+            </w:r>
+            <w:r>
+              <w:t>, et prévues pour être importées ailleurs.</w:t>
             </w:r>
           </w:p>
           <w:p/>
@@ -1348,6 +1423,7 @@
             <w:r>
               <w:rPr>
                 <w:rFonts w:ascii="Courier New" w:hAnsi="Courier New" w:cs="Courier New"/>
+                <w:noProof/>
                 <w:position w:val="-10"/>
               </w:rPr>
               <w:drawing>
@@ -1432,6 +1508,7 @@
             <w:r>
               <w:rPr>
                 <w:rFonts w:ascii="Courier New" w:hAnsi="Courier New" w:cs="Courier New"/>
+                <w:noProof/>
                 <w:position w:val="-10"/>
               </w:rPr>
               <w:drawing>
@@ -1516,6 +1593,7 @@
             <w:r>
               <w:rPr>
                 <w:rFonts w:ascii="Courier New" w:hAnsi="Courier New" w:cs="Courier New"/>
+                <w:noProof/>
                 <w:position w:val="-10"/>
               </w:rPr>
               <w:drawing>
@@ -1600,6 +1678,7 @@
             <w:r>
               <w:rPr>
                 <w:rFonts w:ascii="Courier New" w:hAnsi="Courier New" w:cs="Courier New"/>
+                <w:noProof/>
                 <w:position w:val="-10"/>
               </w:rPr>
               <w:drawing>
@@ -1662,7 +1741,6 @@
         </w:tc>
       </w:tr>
     </w:tbl>
-    <w:p/>
     <w:p>
       <w:pPr>
         <w:rPr>
@@ -1671,15 +1749,14 @@
           <w:color w:val="0070C0"/>
         </w:rPr>
       </w:pPr>
-    </w:p>
-    <w:p>
-      <w:pPr>
+      <w:r>
         <w:rPr>
           <w:b/>
           <w:bCs/>
           <w:color w:val="0070C0"/>
         </w:rPr>
-      </w:pPr>
+        <w:br/>
+      </w:r>
       <w:r>
         <w:rPr>
           <w:b/>

</xml_diff>